<commit_message>
Replace PDF generator with direct PDF download, remove Word button
</commit_message>
<xml_diff>
--- a/resume.docx
+++ b/resume.docx
@@ -18,13 +18,263 @@
         <w:tblLook w:val="04A0" w:firstRow="1" w:lastRow="0" w:firstColumn="1" w:lastColumn="0" w:noHBand="0" w:noVBand="1"/>
       </w:tblPr>
       <w:tblGrid>
-        <w:gridCol w:w="11412"/>
+        <w:gridCol w:w="11199"/>
       </w:tblGrid>
       <w:tr>
         <w:tc>
           <w:tcPr>
             <w:tcW w:w="11199" w:type="dxa"/>
           </w:tcPr>
+          <w:tbl>
+            <w:tblPr>
+              <w:tblStyle w:val="TableGrid"/>
+              <w:tblpPr w:leftFromText="180" w:rightFromText="180" w:horzAnchor="page" w:tblpX="36" w:tblpY="-1420"/>
+              <w:tblW w:w="10768" w:type="dxa"/>
+              <w:shd w:val="clear" w:color="auto" w:fill="95B3D7" w:themeFill="accent1" w:themeFillTint="99"/>
+              <w:tblLayout w:type="fixed"/>
+              <w:tblLook w:val="04A0" w:firstRow="1" w:lastRow="0" w:firstColumn="1" w:lastColumn="0" w:noHBand="0" w:noVBand="1"/>
+            </w:tblPr>
+            <w:tblGrid>
+              <w:gridCol w:w="1782"/>
+              <w:gridCol w:w="8986"/>
+            </w:tblGrid>
+            <w:tr>
+              <w:trPr>
+                <w:trHeight w:val="431"/>
+              </w:trPr>
+              <w:tc>
+                <w:tcPr>
+                  <w:tcW w:w="1782" w:type="dxa"/>
+                  <w:shd w:val="clear" w:color="auto" w:fill="EEECE1" w:themeFill="background2"/>
+                </w:tcPr>
+                <w:p>
+                  <w:pPr>
+                    <w:rPr>
+                      <w:rFonts w:ascii="Times New Roman" w:hAnsi="Times New Roman" w:cs="Times New Roman"/>
+                    </w:rPr>
+                  </w:pPr>
+                  <w:r>
+                    <w:rPr>
+                      <w:rFonts w:ascii="Times New Roman" w:hAnsi="Times New Roman" w:cs="Times New Roman"/>
+                      <w:noProof/>
+                      <w:lang w:bidi="te-IN"/>
+                    </w:rPr>
+                    <w:drawing>
+                      <wp:inline distT="0" distB="0" distL="0" distR="0" wp14:anchorId="6B2BBC75" wp14:editId="07E9B371">
+                        <wp:extent cx="993775" cy="1192695"/>
+                        <wp:effectExtent l="0" t="0" r="635" b="7620"/>
+                        <wp:docPr id="1" name="Picture 1" descr="A person with glasses and a beard&#10;&#10;AI-generated content may be incorrect."/>
+                        <wp:cNvGraphicFramePr>
+                          <a:graphicFrameLocks xmlns:a="http://schemas.openxmlformats.org/drawingml/2006/main" noChangeAspect="1"/>
+                        </wp:cNvGraphicFramePr>
+                        <a:graphic xmlns:a="http://schemas.openxmlformats.org/drawingml/2006/main">
+                          <a:graphicData uri="http://schemas.openxmlformats.org/drawingml/2006/picture">
+                            <pic:pic xmlns:pic="http://schemas.openxmlformats.org/drawingml/2006/picture">
+                              <pic:nvPicPr>
+                                <pic:cNvPr id="1" name="Picture 1" descr="A person with glasses and a beard&#10;&#10;AI-generated content may be incorrect."/>
+                                <pic:cNvPicPr/>
+                              </pic:nvPicPr>
+                              <pic:blipFill>
+                                <a:blip r:embed="rId8"/>
+                                <a:stretch>
+                                  <a:fillRect/>
+                                </a:stretch>
+                              </pic:blipFill>
+                              <pic:spPr>
+                                <a:xfrm>
+                                  <a:off x="0" y="0"/>
+                                  <a:ext cx="993775" cy="1192695"/>
+                                </a:xfrm>
+                                <a:prstGeom prst="rect">
+                                  <a:avLst/>
+                                </a:prstGeom>
+                              </pic:spPr>
+                            </pic:pic>
+                          </a:graphicData>
+                        </a:graphic>
+                      </wp:inline>
+                    </w:drawing>
+                  </w:r>
+                </w:p>
+              </w:tc>
+              <w:tc>
+                <w:tcPr>
+                  <w:tcW w:w="8986" w:type="dxa"/>
+                  <w:shd w:val="clear" w:color="auto" w:fill="95B3D7" w:themeFill="accent1" w:themeFillTint="99"/>
+                </w:tcPr>
+                <w:p>
+                  <w:pPr>
+                    <w:rPr>
+                      <w:rFonts w:ascii="Times New Roman" w:hAnsi="Times New Roman" w:cs="Times New Roman"/>
+                    </w:rPr>
+                  </w:pPr>
+                </w:p>
+                <w:p>
+                  <w:pPr>
+                    <w:rPr>
+                      <w:rFonts w:ascii="Times New Roman" w:hAnsi="Times New Roman" w:cs="Times New Roman"/>
+                      <w:b/>
+                      <w:sz w:val="24"/>
+                      <w:szCs w:val="24"/>
+                    </w:rPr>
+                  </w:pPr>
+                  <w:r>
+                    <w:rPr>
+                      <w:rFonts w:ascii="Times New Roman" w:hAnsi="Times New Roman" w:cs="Times New Roman"/>
+                      <w:b/>
+                      <w:sz w:val="24"/>
+                      <w:szCs w:val="24"/>
+                    </w:rPr>
+                    <w:t>Pruthvi Raj Darapu</w:t>
+                  </w:r>
+                </w:p>
+                <w:p>
+                  <w:pPr>
+                    <w:rPr>
+                      <w:rFonts w:asciiTheme="majorHAnsi" w:hAnsiTheme="majorHAnsi" w:cstheme="majorHAnsi"/>
+                      <w:bCs/>
+                      <w:sz w:val="20"/>
+                      <w:szCs w:val="20"/>
+                    </w:rPr>
+                  </w:pPr>
+                  <w:r>
+                    <w:rPr>
+                      <w:rFonts w:asciiTheme="majorHAnsi" w:hAnsiTheme="majorHAnsi" w:cstheme="majorHAnsi"/>
+                      <w:bCs/>
+                      <w:sz w:val="20"/>
+                      <w:szCs w:val="20"/>
+                    </w:rPr>
+                    <w:t>Associate Director – Cloud, DevOps, Data &amp; IT Operations</w:t>
+                  </w:r>
+                  <w:r>
+                    <w:rPr>
+                      <w:rFonts w:asciiTheme="majorHAnsi" w:hAnsiTheme="majorHAnsi" w:cstheme="majorHAnsi"/>
+                      <w:bCs/>
+                      <w:sz w:val="20"/>
+                      <w:szCs w:val="20"/>
+                    </w:rPr>
+                    <w:br/>
+                    <w:t>AWS Certified Solutions Architect | 8+ Years | Multi-Cloud &amp; FinOps</w:t>
+                  </w:r>
+                  <w:r>
+                    <w:rPr>
+                      <w:rFonts w:asciiTheme="majorHAnsi" w:hAnsiTheme="majorHAnsi" w:cstheme="majorHAnsi"/>
+                      <w:bCs/>
+                      <w:sz w:val="20"/>
+                      <w:szCs w:val="20"/>
+                    </w:rPr>
+                    <w:br/>
+                    <w:t>AWS · Azure · Terraform · Kubernetes · Jenkins · Ansible · Python</w:t>
+                  </w:r>
+                </w:p>
+                <w:p>
+                  <w:pPr>
+                    <w:rPr>
+                      <w:rFonts w:asciiTheme="majorHAnsi" w:hAnsiTheme="majorHAnsi" w:cstheme="majorHAnsi"/>
+                      <w:sz w:val="18"/>
+                      <w:szCs w:val="18"/>
+                    </w:rPr>
+                  </w:pPr>
+                  <w:r>
+                    <w:rPr>
+                      <w:rFonts w:asciiTheme="majorHAnsi" w:hAnsiTheme="majorHAnsi" w:cstheme="majorHAnsi"/>
+                      <w:sz w:val="18"/>
+                      <w:szCs w:val="18"/>
+                    </w:rPr>
+                    <w:t xml:space="preserve">Email: </w:t>
+                  </w:r>
+                  <w:hyperlink r:id="rId9" w:history="1">
+                    <w:r>
+                      <w:rPr>
+                        <w:rStyle w:val="Hyperlink"/>
+                        <w:rFonts w:asciiTheme="majorHAnsi" w:hAnsiTheme="majorHAnsi" w:cstheme="majorHAnsi"/>
+                        <w:sz w:val="18"/>
+                        <w:szCs w:val="18"/>
+                      </w:rPr>
+                      <w:t>pruthvirajdarapu@gmail.com</w:t>
+                    </w:r>
+                  </w:hyperlink>
+                  <w:r>
+                    <w:rPr>
+                      <w:rFonts w:asciiTheme="majorHAnsi" w:hAnsiTheme="majorHAnsi" w:cstheme="majorHAnsi"/>
+                      <w:sz w:val="18"/>
+                      <w:szCs w:val="18"/>
+                    </w:rPr>
+                    <w:t xml:space="preserve"> </w:t>
+                  </w:r>
+                  <w:r>
+                    <w:rPr>
+                      <w:rFonts w:asciiTheme="majorHAnsi" w:hAnsiTheme="majorHAnsi" w:cstheme="majorHAnsi"/>
+                      <w:sz w:val="18"/>
+                      <w:szCs w:val="18"/>
+                    </w:rPr>
+                    <w:t xml:space="preserve"> </w:t>
+                  </w:r>
+                  <w:r>
+                    <w:rPr>
+                      <w:rFonts w:asciiTheme="majorHAnsi" w:hAnsiTheme="majorHAnsi" w:cstheme="majorHAnsi"/>
+                      <w:sz w:val="18"/>
+                      <w:szCs w:val="18"/>
+                    </w:rPr>
+                    <w:t xml:space="preserve">Address: </w:t>
+                  </w:r>
+                  <w:r>
+                    <w:rPr>
+                      <w:rFonts w:asciiTheme="majorHAnsi" w:hAnsiTheme="majorHAnsi" w:cstheme="majorHAnsi"/>
+                      <w:sz w:val="18"/>
+                      <w:szCs w:val="18"/>
+                    </w:rPr>
+                    <w:t>Hyderabad</w:t>
+                  </w:r>
+                  <w:r>
+                    <w:rPr>
+                      <w:rFonts w:asciiTheme="majorHAnsi" w:hAnsiTheme="majorHAnsi" w:cstheme="majorHAnsi"/>
+                      <w:sz w:val="18"/>
+                      <w:szCs w:val="18"/>
+                    </w:rPr>
+                    <w:t>, India</w:t>
+                  </w:r>
+                </w:p>
+                <w:p>
+                  <w:pPr>
+                    <w:rPr>
+                      <w:rFonts w:ascii="Times New Roman" w:hAnsi="Times New Roman" w:cs="Times New Roman"/>
+                    </w:rPr>
+                  </w:pPr>
+                  <w:r>
+                    <w:rPr>
+                      <w:rFonts w:asciiTheme="majorHAnsi" w:hAnsiTheme="majorHAnsi" w:cstheme="majorHAnsi"/>
+                      <w:sz w:val="18"/>
+                      <w:szCs w:val="18"/>
+                    </w:rPr>
+                    <w:t>Phone: +91 9492246177</w:t>
+                  </w:r>
+                  <w:r>
+                    <w:rPr>
+                      <w:rFonts w:asciiTheme="majorHAnsi" w:hAnsiTheme="majorHAnsi" w:cstheme="majorHAnsi"/>
+                      <w:sz w:val="18"/>
+                      <w:szCs w:val="18"/>
+                    </w:rPr>
+                    <w:t xml:space="preserve">    </w:t>
+                  </w:r>
+                  <w:r>
+                    <w:rPr>
+                      <w:rFonts w:asciiTheme="majorHAnsi" w:hAnsiTheme="majorHAnsi" w:cstheme="majorHAnsi"/>
+                      <w:sz w:val="18"/>
+                      <w:szCs w:val="18"/>
+                    </w:rPr>
+                    <w:t>LinkedIn: https://www.linkedin.com/in/pruthviraj0808/</w:t>
+                  </w:r>
+                  <w:r>
+                    <w:rPr>
+                      <w:rFonts w:ascii="Times New Roman" w:hAnsi="Times New Roman" w:cs="Times New Roman"/>
+                    </w:rPr>
+                    <w:t xml:space="preserve"> </w:t>
+                  </w:r>
+                </w:p>
+              </w:tc>
+            </w:tr>
+          </w:tbl>
           <w:p>
             <w:pPr>
               <w:jc w:val="center"/>
@@ -34,48 +284,6 @@
                 <w:sz w:val="44"/>
               </w:rPr>
             </w:pPr>
-            <w:r>
-              <w:rPr>
-                <w:b/>
-                <w:color w:val="1A3A5C"/>
-                <w:sz w:val="44"/>
-              </w:rPr>
-              <w:drawing>
-                <wp:inline distT="0" distB="0" distL="0" distR="0" wp14:anchorId="7EFD71CF" wp14:editId="27DA866A">
-                  <wp:extent cx="7109460" cy="1871980"/>
-                  <wp:effectExtent l="0" t="0" r="0" b="0"/>
-                  <wp:docPr id="153977187" name="Picture 1"/>
-                  <wp:cNvGraphicFramePr>
-                    <a:graphicFrameLocks xmlns:a="http://schemas.openxmlformats.org/drawingml/2006/main" noChangeAspect="1"/>
-                  </wp:cNvGraphicFramePr>
-                  <a:graphic xmlns:a="http://schemas.openxmlformats.org/drawingml/2006/main">
-                    <a:graphicData uri="http://schemas.openxmlformats.org/drawingml/2006/picture">
-                      <pic:pic xmlns:pic="http://schemas.openxmlformats.org/drawingml/2006/picture">
-                        <pic:nvPicPr>
-                          <pic:cNvPr id="153977187" name=""/>
-                          <pic:cNvPicPr/>
-                        </pic:nvPicPr>
-                        <pic:blipFill>
-                          <a:blip r:embed="rId8"/>
-                          <a:stretch>
-                            <a:fillRect/>
-                          </a:stretch>
-                        </pic:blipFill>
-                        <pic:spPr>
-                          <a:xfrm>
-                            <a:off x="0" y="0"/>
-                            <a:ext cx="7109460" cy="1871980"/>
-                          </a:xfrm>
-                          <a:prstGeom prst="rect">
-                            <a:avLst/>
-                          </a:prstGeom>
-                        </pic:spPr>
-                      </pic:pic>
-                    </a:graphicData>
-                  </a:graphic>
-                </wp:inline>
-              </w:drawing>
-            </w:r>
           </w:p>
         </w:tc>
       </w:tr>
@@ -470,7 +678,6 @@
                 <w:b/>
                 <w:sz w:val="20"/>
               </w:rPr>
-              <w:lastRenderedPageBreak/>
               <w:t>Version Control</w:t>
             </w:r>
           </w:p>
@@ -542,7 +749,14 @@
               <w:rPr>
                 <w:sz w:val="20"/>
               </w:rPr>
-              <w:t>AWS Cost Explorer, CUR 2.0, Amazon QuickSight, AWS Budgets, Savings Plans</w:t>
+              <w:t xml:space="preserve">AWS Cost Explorer, CUR 2.0, Amazon QuickSight, AWS </w:t>
+            </w:r>
+            <w:r>
+              <w:rPr>
+                <w:sz w:val="20"/>
+              </w:rPr>
+              <w:lastRenderedPageBreak/>
+              <w:t>Budgets, Savings Plans</w:t>
             </w:r>
           </w:p>
         </w:tc>
@@ -558,6 +772,7 @@
                 <w:b/>
                 <w:sz w:val="20"/>
               </w:rPr>
+              <w:lastRenderedPageBreak/>
               <w:t>Scripting &amp; Programming</w:t>
             </w:r>
           </w:p>
@@ -1008,7 +1223,6 @@
         <w:rPr>
           <w:sz w:val="20"/>
         </w:rPr>
-        <w:lastRenderedPageBreak/>
         <w:t>Built automated monthly cost reporting system using Lambda, EventBridge, and SES with cross-account IAM, eliminating manual reporting processes for executive stakeholders and enabling real-time cost governance.</w:t>
       </w:r>
     </w:p>
@@ -1044,6 +1258,7 @@
         <w:rPr>
           <w:sz w:val="20"/>
         </w:rPr>
+        <w:lastRenderedPageBreak/>
         <w:t xml:space="preserve">Developed zero-downtime OS patching automation using Python and AWS SSM, ensuring </w:t>
       </w:r>
       <w:r>
@@ -1667,7 +1882,6 @@
         <w:rPr>
           <w:sz w:val="20"/>
         </w:rPr>
-        <w:lastRenderedPageBreak/>
         <w:t xml:space="preserve">Deployed </w:t>
       </w:r>
       <w:r>
@@ -1727,6 +1941,7 @@
           <w:b/>
           <w:sz w:val="22"/>
         </w:rPr>
+        <w:lastRenderedPageBreak/>
         <w:t>Wells Fargo EGS, Hyderabad, India | 07/2017 – 07/2019</w:t>
       </w:r>
     </w:p>
@@ -2328,9 +2543,9 @@
       </w:r>
     </w:p>
     <w:sectPr>
-      <w:headerReference w:type="even" r:id="rId9"/>
-      <w:headerReference w:type="default" r:id="rId10"/>
-      <w:headerReference w:type="first" r:id="rId11"/>
+      <w:headerReference w:type="even" r:id="rId10"/>
+      <w:headerReference w:type="default" r:id="rId11"/>
+      <w:headerReference w:type="first" r:id="rId12"/>
       <w:pgSz w:w="12240" w:h="15840"/>
       <w:pgMar w:top="850" w:right="1134" w:bottom="850" w:left="1134" w:header="720" w:footer="720" w:gutter="0"/>
       <w:cols w:space="720"/>
@@ -2484,7 +2699,6 @@
               <v:path gradientshapeok="t" o:connecttype="rect"/>
             </v:shapetype>
             <v:shape id="Text Box 2" o:spid="_x0000_s1026" type="#_x0000_t202" alt="INTERNAL" style="position:absolute;margin-left:0;margin-top:0;width:64.05pt;height:29.05pt;z-index:251659264;visibility:visible;mso-wrap-style:none;mso-wrap-distance-left:0;mso-wrap-distance-top:0;mso-wrap-distance-right:0;mso-wrap-distance-bottom:0;mso-position-horizontal:left;mso-position-horizontal-relative:page;mso-position-vertical:top;mso-position-vertical-relative:page;v-text-anchor:top" o:gfxdata="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" filled="f" stroked="f">
-              <v:fill o:detectmouseclick="t"/>
               <v:textbox style="mso-fit-shape-to-text:t" inset="20pt,15pt,0,0">
                 <w:txbxContent>
                   <w:p>
@@ -2583,16 +2797,6 @@
                               <w:szCs w:val="20"/>
                             </w:rPr>
                           </w:pPr>
-                          <w:r>
-                            <w:rPr>
-                              <w:rFonts w:ascii="Aptos" w:eastAsia="Aptos" w:hAnsi="Aptos" w:cs="Aptos"/>
-                              <w:noProof/>
-                              <w:color w:val="000000"/>
-                              <w:sz w:val="20"/>
-                              <w:szCs w:val="20"/>
-                            </w:rPr>
-                            <w:t>INTERNAL</w:t>
-                          </w:r>
                         </w:p>
                       </w:txbxContent>
                     </wps:txbx>
@@ -2615,7 +2819,6 @@
               <v:path gradientshapeok="t" o:connecttype="rect"/>
             </v:shapetype>
             <v:shape id="Text Box 3" o:spid="_x0000_s1027" type="#_x0000_t202" alt="INTERNAL" style="position:absolute;margin-left:0;margin-top:0;width:64.05pt;height:29.05pt;z-index:251660288;visibility:visible;mso-wrap-style:none;mso-wrap-distance-left:0;mso-wrap-distance-top:0;mso-wrap-distance-right:0;mso-wrap-distance-bottom:0;mso-position-horizontal:left;mso-position-horizontal-relative:page;mso-position-vertical:top;mso-position-vertical-relative:page;v-text-anchor:top" o:gfxdata="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" filled="f" stroked="f">
-              <v:fill o:detectmouseclick="t"/>
               <v:textbox style="mso-fit-shape-to-text:t" inset="20pt,15pt,0,0">
                 <w:txbxContent>
                   <w:p>
@@ -2629,16 +2832,6 @@
                         <w:szCs w:val="20"/>
                       </w:rPr>
                     </w:pPr>
-                    <w:r>
-                      <w:rPr>
-                        <w:rFonts w:ascii="Aptos" w:eastAsia="Aptos" w:hAnsi="Aptos" w:cs="Aptos"/>
-                        <w:noProof/>
-                        <w:color w:val="000000"/>
-                        <w:sz w:val="20"/>
-                        <w:szCs w:val="20"/>
-                      </w:rPr>
-                      <w:t>INTERNAL</w:t>
-                    </w:r>
                   </w:p>
                 </w:txbxContent>
               </v:textbox>
@@ -2746,7 +2939,6 @@
               <v:path gradientshapeok="t" o:connecttype="rect"/>
             </v:shapetype>
             <v:shape id="Text Box 1" o:spid="_x0000_s1028" type="#_x0000_t202" alt="INTERNAL" style="position:absolute;margin-left:0;margin-top:0;width:64.05pt;height:29.05pt;z-index:251658240;visibility:visible;mso-wrap-style:none;mso-wrap-distance-left:0;mso-wrap-distance-top:0;mso-wrap-distance-right:0;mso-wrap-distance-bottom:0;mso-position-horizontal:left;mso-position-horizontal-relative:page;mso-position-vertical:top;mso-position-vertical-relative:page;v-text-anchor:top" o:gfxdata="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" filled="f" stroked="f">
-              <v:fill o:detectmouseclick="t"/>
               <v:textbox style="mso-fit-shape-to-text:t" inset="20pt,15pt,0,0">
                 <w:txbxContent>
                   <w:p>
@@ -3158,7 +3350,7 @@
     <w:lsdException w:name="Table Web 2" w:semiHidden="1" w:unhideWhenUsed="1"/>
     <w:lsdException w:name="Table Web 3" w:semiHidden="1" w:unhideWhenUsed="1"/>
     <w:lsdException w:name="Balloon Text" w:semiHidden="1" w:unhideWhenUsed="1"/>
-    <w:lsdException w:name="Table Grid" w:uiPriority="59"/>
+    <w:lsdException w:name="Table Grid" w:uiPriority="39"/>
     <w:lsdException w:name="Table Theme" w:semiHidden="1" w:unhideWhenUsed="1"/>
     <w:lsdException w:name="Placeholder Text" w:semiHidden="1"/>
     <w:lsdException w:name="No Spacing" w:uiPriority="1" w:qFormat="1"/>
@@ -3593,7 +3785,6 @@
   <w:style w:type="character" w:default="1" w:styleId="DefaultParagraphFont">
     <w:name w:val="Default Paragraph Font"/>
     <w:uiPriority w:val="1"/>
-    <w:semiHidden/>
     <w:unhideWhenUsed/>
   </w:style>
   <w:style w:type="table" w:default="1" w:styleId="TableNormal">
@@ -4319,7 +4510,7 @@
   <w:style w:type="table" w:styleId="TableGrid">
     <w:name w:val="Table Grid"/>
     <w:basedOn w:val="TableNormal"/>
-    <w:uiPriority w:val="59"/>
+    <w:uiPriority w:val="39"/>
     <w:rsid w:val="00FC693F"/>
     <w:pPr>
       <w:spacing w:after="0" w:line="240" w:lineRule="auto"/>

</xml_diff>